<commit_message>
Lisa austuse nõue, loodusseadus ja vastastikmõju strateegia
Täienda kodaniku tõotust: austuse ja õigluse nõue, mida külvad seda
lõikad põhimõte ning tit-for-tat vastastikmõju strateegia.

Co-authored-by: reneealuste-commits <reneealuste-commits@users.noreply.github.com>
</commit_message>
<xml_diff>
--- a/kodaniku-tootus.docx
+++ b/kodaniku-tootus.docx
@@ -105,7 +105,7 @@
           <w:i w:val="0"/>
           <w:sz w:val="26"/>
         </w:rPr>
-        <w:t>Mina, inimene, tõotan jääda ustavaks tõele, väärikusele ja inimestele, kes minust sõltuvad; kaitsta head endas ja teistes kogu oma mõistuse ja hoole eest; olla valmis ohverdama mugavust ja ego selle eest, mis on õige; hoida kinni sisemisest distsipliinist; ning täita oma kohustusi ausalt ja järjepidevalt, teades, et vastasel korral maksan hinda ise.</w:t>
+        <w:t>Mina, inimene, tõotan jääda ustavaks tõele, väärikusele ja inimestele, kes minust sõltuvad; kaitsta head endas ja teistes kogu oma mõistuse ja hoole eest; olla valmis ohverdama mugavust ja ego selle eest, mis on õige; hoida kinni sisemisest distsipliinist; ning täita oma kohustusi ausalt ja järjepidevalt, teades, et vastasel korral maksan hinda ise; nõuan, et minuga käitutakse austusega ja õiglaselt - ja käitun teistega samamoodi; tean, et mida külvad, seda lõikad: iga tegu paneb seemne, mis tuleb ringiga tagasi; alustan heana, kuid ei lase kurja minna vastutuseta - see on minu vastastikmõju strateegia.</w:t>
       </w:r>
     </w:p>
     <w:p>
@@ -164,7 +164,7 @@
           <w:i w:val="0"/>
           <w:sz w:val="24"/>
         </w:rPr>
-        <w:t>— Olen inimene, kes peab oma sõna.</w:t>
+        <w:t>- Olen inimene, kes peab oma sõna.</w:t>
       </w:r>
     </w:p>
     <w:p>
@@ -179,7 +179,7 @@
           <w:i w:val="0"/>
           <w:sz w:val="24"/>
         </w:rPr>
-        <w:t>— Olen inimene, kes kaitseb head — alustades iseendast.</w:t>
+        <w:t>- Olen inimene, kes kaitseb head — alustades iseendast.</w:t>
       </w:r>
     </w:p>
     <w:p>
@@ -194,7 +194,7 @@
           <w:i w:val="0"/>
           <w:sz w:val="24"/>
         </w:rPr>
-        <w:t>— Olen inimene, kes räägib tõtt, isegi kui see maksab.</w:t>
+        <w:t>- Olen inimene, kes räägib tõtt, isegi kui see maksab.</w:t>
       </w:r>
     </w:p>
     <w:p>
@@ -209,7 +209,7 @@
           <w:i w:val="0"/>
           <w:sz w:val="24"/>
         </w:rPr>
-        <w:t>— Olen inimene, kes ilmub kohale nende jaoks, kes minust loodavad.</w:t>
+        <w:t>- Olen inimene, kes ilmub kohale nende jaoks, kes minust loodavad.</w:t>
       </w:r>
     </w:p>
     <w:p>
@@ -224,7 +224,7 @@
           <w:i w:val="0"/>
           <w:sz w:val="24"/>
         </w:rPr>
-        <w:t>— Olen inimene, kes valib distsipliini impulsi asemel.</w:t>
+        <w:t>- Olen inimene, kes valib distsipliini impulsi asemel.</w:t>
       </w:r>
     </w:p>
     <w:p>
@@ -239,7 +239,7 @@
           <w:i w:val="0"/>
           <w:sz w:val="24"/>
         </w:rPr>
-        <w:t>— Olen inimene, kes kannab oma valikute hinna.</w:t>
+        <w:t>- Olen inimene, kes kannab oma valikute hinna.</w:t>
       </w:r>
     </w:p>
     <w:p>
@@ -254,7 +254,201 @@
           <w:i w:val="0"/>
           <w:sz w:val="24"/>
         </w:rPr>
-        <w:t>— Olen kodanik — mitte piiri, vaid väärikuse mõttes.</w:t>
+        <w:t>- Olen kodanik - mitte piiri, vaid väärikuse mõttes.</w:t>
+      </w:r>
+    </w:p>
+    <w:p>
+      <w:pPr>
+        <w:spacing w:after="120"/>
+        <w:jc w:val="center"/>
+      </w:pPr>
+      <w:r>
+        <w:rPr>
+          <w:rFonts w:ascii="Georgia" w:hAnsi="Georgia"/>
+          <w:b w:val="0"/>
+          <w:i w:val="0"/>
+          <w:sz w:val="24"/>
+        </w:rPr>
+        <w:t>- Nõuan, et minuga käitutakse austusega ja õiglaselt - ja annan seda tagasi.</w:t>
+      </w:r>
+    </w:p>
+    <w:p>
+      <w:pPr>
+        <w:spacing w:after="120"/>
+        <w:jc w:val="center"/>
+      </w:pPr>
+      <w:r>
+        <w:rPr>
+          <w:rFonts w:ascii="Georgia" w:hAnsi="Georgia"/>
+          <w:b w:val="0"/>
+          <w:i w:val="0"/>
+          <w:sz w:val="24"/>
+        </w:rPr>
+        <w:t>- Külvin head, sest tean: mida külvad, seda lõikad.</w:t>
+      </w:r>
+    </w:p>
+    <w:p>
+      <w:pPr>
+        <w:spacing w:after="120"/>
+        <w:jc w:val="center"/>
+      </w:pPr>
+      <w:r>
+        <w:rPr>
+          <w:rFonts w:ascii="Georgia" w:hAnsi="Georgia"/>
+          <w:b w:val="0"/>
+          <w:i w:val="0"/>
+          <w:sz w:val="24"/>
+        </w:rPr>
+        <w:t>- Alustan heana, kuid ei lase kurja minna vastutuseta.</w:t>
+      </w:r>
+    </w:p>
+    <w:p>
+      <w:pPr>
+        <w:spacing w:before="360" w:after="200"/>
+        <w:jc w:val="center"/>
+      </w:pPr>
+      <w:r>
+        <w:rPr>
+          <w:rFonts w:ascii="Calibri" w:hAnsi="Calibri"/>
+          <w:b/>
+          <w:sz w:val="28"/>
+        </w:rPr>
+        <w:t>Loodusseadus ja vastastikmõju</w:t>
+      </w:r>
+    </w:p>
+    <w:p>
+      <w:pPr>
+        <w:spacing w:after="200"/>
+        <w:jc w:val="center"/>
+      </w:pPr>
+      <w:r>
+        <w:rPr>
+          <w:rFonts w:ascii="Georgia" w:hAnsi="Georgia"/>
+          <w:b w:val="0"/>
+          <w:i/>
+          <w:sz w:val="24"/>
+        </w:rPr>
+        <w:t>Mida külvad, seda lõikad - see pole ainult vanasõna. See on loodusseadus.</w:t>
+      </w:r>
+    </w:p>
+    <w:p>
+      <w:pPr>
+        <w:spacing w:after="240"/>
+        <w:jc w:val="center"/>
+      </w:pPr>
+      <w:r>
+        <w:rPr>
+          <w:rFonts w:ascii="Georgia" w:hAnsi="Georgia"/>
+          <w:b w:val="0"/>
+          <w:i w:val="0"/>
+          <w:sz w:val="22"/>
+        </w:rPr>
+        <w:t>Iga sõna, iga tegu, iga valik paneb seemne. Head seemned kasvavad head saagi. Halvad seemned tulevad ringiga tagasi - mitte alati kohe, aga alati. Sa ei kontrolli saaki, aga sa kontrollid külvikut.</w:t>
+      </w:r>
+    </w:p>
+    <w:p>
+      <w:pPr>
+        <w:spacing w:after="80"/>
+        <w:jc w:val="center"/>
+      </w:pPr>
+      <w:r>
+        <w:rPr>
+          <w:rFonts w:ascii="Georgia" w:hAnsi="Georgia"/>
+          <w:b/>
+          <w:i w:val="0"/>
+          <w:sz w:val="24"/>
+        </w:rPr>
+        <w:t>Külvamine</w:t>
+      </w:r>
+    </w:p>
+    <w:p>
+      <w:pPr>
+        <w:spacing w:after="200"/>
+        <w:jc w:val="center"/>
+      </w:pPr>
+      <w:r>
+        <w:rPr>
+          <w:rFonts w:ascii="Georgia" w:hAnsi="Georgia"/>
+          <w:b w:val="0"/>
+          <w:i w:val="0"/>
+          <w:sz w:val="22"/>
+        </w:rPr>
+        <w:t>Enne kui teed, küsi: mida ma praegu külvin? Kas see on see, mida tahan lõigata?</w:t>
+      </w:r>
+    </w:p>
+    <w:p>
+      <w:pPr>
+        <w:spacing w:after="80"/>
+        <w:jc w:val="center"/>
+      </w:pPr>
+      <w:r>
+        <w:rPr>
+          <w:rFonts w:ascii="Georgia" w:hAnsi="Georgia"/>
+          <w:b/>
+          <w:i w:val="0"/>
+          <w:sz w:val="24"/>
+        </w:rPr>
+        <w:t>Lõikamine</w:t>
+      </w:r>
+    </w:p>
+    <w:p>
+      <w:pPr>
+        <w:spacing w:after="200"/>
+        <w:jc w:val="center"/>
+      </w:pPr>
+      <w:r>
+        <w:rPr>
+          <w:rFonts w:ascii="Georgia" w:hAnsi="Georgia"/>
+          <w:b w:val="0"/>
+          <w:i w:val="0"/>
+          <w:sz w:val="22"/>
+        </w:rPr>
+        <w:t>Kui elu toob sulle rasket, vaata ausalt: kas ma ise külvatasin selle seemne?</w:t>
+      </w:r>
+    </w:p>
+    <w:p>
+      <w:pPr>
+        <w:spacing w:after="80"/>
+        <w:jc w:val="center"/>
+      </w:pPr>
+      <w:r>
+        <w:rPr>
+          <w:rFonts w:ascii="Georgia" w:hAnsi="Georgia"/>
+          <w:b/>
+          <w:i w:val="0"/>
+          <w:sz w:val="24"/>
+        </w:rPr>
+        <w:t>Vastastikmõju (tit-for-tat)</w:t>
+      </w:r>
+    </w:p>
+    <w:p>
+      <w:pPr>
+        <w:spacing w:after="200"/>
+        <w:jc w:val="center"/>
+      </w:pPr>
+      <w:r>
+        <w:rPr>
+          <w:rFonts w:ascii="Georgia" w:hAnsi="Georgia"/>
+          <w:b w:val="0"/>
+          <w:i w:val="0"/>
+          <w:sz w:val="22"/>
+        </w:rPr>
+        <w:t>Alusta alati heana. Kui teine on hea - ole hea. Kui teine on kuri - sea piir. Anna teine võimalus, kui keegi eksib. Ära ole lollukindel. Ära ole ka nõrk.</w:t>
+      </w:r>
+    </w:p>
+    <w:p>
+      <w:pPr>
+        <w:spacing w:after="320"/>
+        <w:jc w:val="center"/>
+      </w:pPr>
+      <w:r>
+        <w:rPr>
+          <w:rFonts w:ascii="Georgia" w:hAnsi="Georgia"/>
+          <w:b w:val="0"/>
+          <w:i/>
+          <w:sz w:val="20"/>
+        </w:rPr>
+        <w:t>Vastastikmõju strateegia lihtsalt: 1. Alusta koostööga · 2. Vasta samaga, mida saad · 3. Anna andeks üks kord · 4. Kui kurjus kordub - kaitse end · 5. Ära kunagi löö esimesena</w:t>
       </w:r>
     </w:p>
     <w:p>
@@ -657,6 +851,96 @@
           <w:sz w:val="22"/>
         </w:rPr>
         <w:t>Keegi ei vaata. Sa pead ikkagi oma sõna. See oled sina.</w:t>
+      </w:r>
+    </w:p>
+    <w:p>
+      <w:pPr>
+        <w:spacing w:after="80"/>
+        <w:jc w:val="center"/>
+      </w:pPr>
+      <w:r>
+        <w:rPr>
+          <w:rFonts w:ascii="Georgia" w:hAnsi="Georgia"/>
+          <w:b/>
+          <w:i w:val="0"/>
+          <w:sz w:val="24"/>
+        </w:rPr>
+        <w:t>Kui sind ei austa</w:t>
+      </w:r>
+    </w:p>
+    <w:p>
+      <w:pPr>
+        <w:spacing w:after="200"/>
+        <w:jc w:val="center"/>
+      </w:pPr>
+      <w:r>
+        <w:rPr>
+          <w:rFonts w:ascii="Georgia" w:hAnsi="Georgia"/>
+          <w:b w:val="0"/>
+          <w:i w:val="0"/>
+          <w:sz w:val="22"/>
+        </w:rPr>
+        <w:t>Sa ei vihastu ega põgene. Sa ütled selgelt: minuga tuleb käituda austusega. See on sinu õigus.</w:t>
+      </w:r>
+    </w:p>
+    <w:p>
+      <w:pPr>
+        <w:spacing w:after="80"/>
+        <w:jc w:val="center"/>
+      </w:pPr>
+      <w:r>
+        <w:rPr>
+          <w:rFonts w:ascii="Georgia" w:hAnsi="Georgia"/>
+          <w:b/>
+          <w:i w:val="0"/>
+          <w:sz w:val="24"/>
+        </w:rPr>
+        <w:t>Kui keegi on hea</w:t>
+      </w:r>
+    </w:p>
+    <w:p>
+      <w:pPr>
+        <w:spacing w:after="200"/>
+        <w:jc w:val="center"/>
+      </w:pPr>
+      <w:r>
+        <w:rPr>
+          <w:rFonts w:ascii="Georgia" w:hAnsi="Georgia"/>
+          <w:b w:val="0"/>
+          <w:i w:val="0"/>
+          <w:sz w:val="22"/>
+        </w:rPr>
+        <w:t>Sa vastad heaga. Külvid head. See on loodusseadus töös.</w:t>
+      </w:r>
+    </w:p>
+    <w:p>
+      <w:pPr>
+        <w:spacing w:after="80"/>
+        <w:jc w:val="center"/>
+      </w:pPr>
+      <w:r>
+        <w:rPr>
+          <w:rFonts w:ascii="Georgia" w:hAnsi="Georgia"/>
+          <w:b/>
+          <w:i w:val="0"/>
+          <w:sz w:val="24"/>
+        </w:rPr>
+        <w:t>Kui keegi kurjust kordab</w:t>
+      </w:r>
+    </w:p>
+    <w:p>
+      <w:pPr>
+        <w:spacing w:after="200"/>
+        <w:jc w:val="center"/>
+      </w:pPr>
+      <w:r>
+        <w:rPr>
+          <w:rFonts w:ascii="Georgia" w:hAnsi="Georgia"/>
+          <w:b w:val="0"/>
+          <w:i w:val="0"/>
+          <w:sz w:val="22"/>
+        </w:rPr>
+        <w:t>Sa ei tasu kurja kurjaga - aga sa sead piiri. Vastastikmõju: üks hoiatus, siis kaitse.</w:t>
       </w:r>
     </w:p>
     <w:p>

</xml_diff>

<commit_message>
Lisa konversioonilugu: YouTube, 42 strateegiat ja tit-for-tat
Kirjelda isiklik teekond loodusseaduseni - kaua teadmata mida teha,
YouTube'i strateegiavideo, 42 programmi võistlus ja tit-for-tat võit.

Co-authored-by: reneealuste-commits <reneealuste-commits@users.noreply.github.com>
</commit_message>
<xml_diff>
--- a/kodaniku-tootus.docx
+++ b/kodaniku-tootus.docx
@@ -314,6 +314,144 @@
           <w:sz w:val="28"/>
         </w:rPr>
         <w:t>Loodusseadus ja vastastikmõju</w:t>
+      </w:r>
+    </w:p>
+    <w:p>
+      <w:pPr>
+        <w:spacing w:before="360" w:after="200"/>
+        <w:jc w:val="center"/>
+      </w:pPr>
+      <w:r>
+        <w:rPr>
+          <w:rFonts w:ascii="Calibri" w:hAnsi="Calibri"/>
+          <w:b/>
+          <w:sz w:val="28"/>
+        </w:rPr>
+        <w:t>Konversioonilugu - kuidas ma sinna jõudsin</w:t>
+      </w:r>
+    </w:p>
+    <w:p>
+      <w:pPr>
+        <w:spacing w:after="200"/>
+        <w:jc w:val="center"/>
+      </w:pPr>
+      <w:r>
+        <w:rPr>
+          <w:rFonts w:ascii="Georgia" w:hAnsi="Georgia"/>
+          <w:b w:val="0"/>
+          <w:i/>
+          <w:sz w:val="24"/>
+        </w:rPr>
+        <w:t>Ma ei teadnud pikka aega, mida ma tegelikult teen.</w:t>
+      </w:r>
+    </w:p>
+    <w:p>
+      <w:pPr>
+        <w:spacing w:after="200"/>
+        <w:jc w:val="center"/>
+      </w:pPr>
+      <w:r>
+        <w:rPr>
+          <w:rFonts w:ascii="Georgia" w:hAnsi="Georgia"/>
+          <w:b w:val="0"/>
+          <w:i w:val="0"/>
+          <w:sz w:val="22"/>
+        </w:rPr>
+        <w:t>Elasin, reageerisin, põrkasin inimestega kokku - aga mul polnud strateegiat. Ma ei teadnud, miks mõned suhted lagunevad ja teised püsivad. Ma ei teadnud, miks mõnikord tundus, et annan liiga palju, ja mõnikord liiga vähe. Lihtsalt elasin edasi, ilma raamita.</w:t>
+      </w:r>
+    </w:p>
+    <w:p>
+      <w:pPr>
+        <w:spacing w:after="200"/>
+        <w:jc w:val="center"/>
+      </w:pPr>
+      <w:r>
+        <w:rPr>
+          <w:rFonts w:ascii="Georgia" w:hAnsi="Georgia"/>
+          <w:b w:val="0"/>
+          <w:i w:val="0"/>
+          <w:sz w:val="22"/>
+        </w:rPr>
+        <w:t>Siis sattusin YouTube'i peale. Üks video rääkis strateegiatest - kuidas arvutiprogrammid võistlevad üksteise vastu, korduvalt, tuhandeid kordi. Kokku oli 42 erinevat strateegiat. Igaüks püüdis võita. Mõni oli alati kuri. Mõni alati hell. Mõni püüdis petta. Mõni andis alla.</w:t>
+      </w:r>
+    </w:p>
+    <w:p>
+      <w:pPr>
+        <w:spacing w:after="200"/>
+        <w:jc w:val="center"/>
+      </w:pPr>
+      <w:r>
+        <w:rPr>
+          <w:rFonts w:ascii="Georgia" w:hAnsi="Georgia"/>
+          <w:b w:val="0"/>
+          <w:i w:val="0"/>
+          <w:sz w:val="22"/>
+        </w:rPr>
+        <w:t>Võitja oli tit-for-tat - vastastikmõju. Alusta heana. Vasta samaga, mida saad. Kui teine on hea - ole hea. Kui teine on kuri - sea piir. Ära löö kunagi esimesena.</w:t>
+      </w:r>
+    </w:p>
+    <w:p>
+      <w:pPr>
+        <w:spacing w:after="240"/>
+        <w:jc w:val="center"/>
+      </w:pPr>
+      <w:r>
+        <w:rPr>
+          <w:rFonts w:ascii="Georgia" w:hAnsi="Georgia"/>
+          <w:b w:val="0"/>
+          <w:i w:val="0"/>
+          <w:sz w:val="22"/>
+        </w:rPr>
+        <w:t>See ei olnud lihtsalt arvutimäng. See oli päriselu. Sellest sai mulle selgeks, miks mida külvad, seda lõikad on loodusseadus - mitte ainult vana õpetus, vaid reegel, mis töötab inimeste, sõprade, laste ja sinu enda vahel.</w:t>
+      </w:r>
+    </w:p>
+    <w:p>
+      <w:pPr>
+        <w:spacing w:after="240"/>
+        <w:jc w:val="center"/>
+      </w:pPr>
+      <w:r>
+        <w:rPr>
+          <w:rFonts w:ascii="Georgia" w:hAnsi="Georgia"/>
+          <w:b/>
+          <w:i w:val="0"/>
+          <w:sz w:val="24"/>
+        </w:rPr>
+        <w:t>Tit-for-tat on ainus strateegia, kus keegi ei kaota.</w:t>
+        <w:br/>
+        <w:t>Inimesed ei kaota. Sõbrad ei kaota.</w:t>
+        <w:br/>
+        <w:t>Suhted lastega ei kaota. Ja sina ise ei kaota.</w:t>
+      </w:r>
+    </w:p>
+    <w:p>
+      <w:pPr>
+        <w:spacing w:after="200"/>
+        <w:jc w:val="center"/>
+      </w:pPr>
+      <w:r>
+        <w:rPr>
+          <w:rFonts w:ascii="Georgia" w:hAnsi="Georgia"/>
+          <w:b w:val="0"/>
+          <w:i w:val="0"/>
+          <w:sz w:val="22"/>
+        </w:rPr>
+        <w:t>Sa ei pea olema nõrk ega kange. Sa ei pea andma ennast ära ega sõdima iga päev. Sa alustad heana - sest see on see, mida sa tahad lõigata. Ja kui keegi ei vasta heaga, sa ei jää vaikides kannatama. Sa sead piiri. See on ausus. See on väärikus. See on loodusseadus.</w:t>
+      </w:r>
+    </w:p>
+    <w:p>
+      <w:pPr>
+        <w:spacing w:after="280"/>
+        <w:jc w:val="center"/>
+      </w:pPr>
+      <w:r>
+        <w:rPr>
+          <w:rFonts w:ascii="Georgia" w:hAnsi="Georgia"/>
+          <w:b w:val="0"/>
+          <w:i/>
+          <w:sz w:val="22"/>
+        </w:rPr>
+        <w:t>Nii jõudsin ma siia. Mitte teooria kaudu. Elu kaudu. Ja ühe video kaudu, mis muutis kõik.</w:t>
       </w:r>
     </w:p>
     <w:p>

</xml_diff>